<commit_message>
feat: Update project KPIs and sprint review documentation, including sprint metrics and backlog adjustments
</commit_message>
<xml_diff>
--- a/docs/Informe general de avance.docx
+++ b/docs/Informe general de avance.docx
@@ -594,7 +594,7 @@
               <w:rPr>
                 <w:sz w:val="18"/>
               </w:rPr>
-              <w:t xml:space="preserve">Sprint 6 · 2/10 – 9/10</w:t>
+              <w:t xml:space="preserve">Sprint 7 · 9/10 – 16/10</w:t>
             </w:r>
           </w:p>
         </w:tc>
@@ -645,7 +645,7 @@
               <w:rPr>
                 <w:sz w:val="18"/>
               </w:rPr>
-              <w:t xml:space="preserve">Sprint 7 · 9/10 – 16/10</w:t>
+              <w:t xml:space="preserve">Sprint 8 · 16/10 – 23/10</w:t>
             </w:r>
           </w:p>
         </w:tc>
@@ -854,7 +854,7 @@
               <w:rPr>
                 <w:sz w:val="18"/>
               </w:rPr>
-              <w:t xml:space="preserve">6 de 11</w:t>
+              <w:t xml:space="preserve">7 de 11</w:t>
             </w:r>
           </w:p>
         </w:tc>
@@ -928,7 +928,7 @@
               <w:rPr>
                 <w:sz w:val="18"/>
               </w:rPr>
-              <w:t xml:space="preserve">103 de 226 SP · 46%</w:t>
+              <w:t xml:space="preserve">130 de 226 SP · 58%</w:t>
             </w:r>
           </w:p>
         </w:tc>
@@ -1002,7 +1002,7 @@
               <w:rPr>
                 <w:sz w:val="18"/>
               </w:rPr>
-              <w:t xml:space="preserve">32 de 34 comprometidas · 94%</w:t>
+              <w:t xml:space="preserve">39 de 42 comprometidas · 93%</w:t>
             </w:r>
           </w:p>
         </w:tc>
@@ -1076,7 +1076,7 @@
               <w:rPr>
                 <w:sz w:val="18"/>
               </w:rPr>
-              <w:t xml:space="preserve">17,2 SP</w:t>
+              <w:t xml:space="preserve">18,6 SP</w:t>
             </w:r>
           </w:p>
         </w:tc>
@@ -1150,7 +1150,7 @@
               <w:rPr>
                 <w:sz w:val="18"/>
               </w:rPr>
-              <w:t xml:space="preserve">19,7 SP</w:t>
+              <w:t xml:space="preserve">23,0 SP</w:t>
             </w:r>
           </w:p>
         </w:tc>
@@ -1224,7 +1224,7 @@
               <w:rPr>
                 <w:sz w:val="18"/>
               </w:rPr>
-              <w:t xml:space="preserve">94% · 103 de 109 SP</w:t>
+              <w:t xml:space="preserve">94% · 130 de 139 SP</w:t>
             </w:r>
           </w:p>
         </w:tc>
@@ -1298,7 +1298,7 @@
               <w:rPr>
                 <w:sz w:val="18"/>
               </w:rPr>
-              <w:t xml:space="preserve">5 de 6 · 83%</w:t>
+              <w:t xml:space="preserve">5 de 7 · 71%</w:t>
             </w:r>
           </w:p>
         </w:tc>
@@ -1372,7 +1372,7 @@
               <w:rPr>
                 <w:sz w:val="18"/>
               </w:rPr>
-              <w:t xml:space="preserve">Sprint 6 · 29 SP</w:t>
+              <w:t xml:space="preserve">Sprint 7 · 30 SP</w:t>
             </w:r>
           </w:p>
         </w:tc>
@@ -1446,7 +1446,7 @@
               <w:rPr>
                 <w:sz w:val="18"/>
               </w:rPr>
-              <w:t xml:space="preserve">123 en 5 sprints</w:t>
+              <w:t xml:space="preserve">96 en 4 sprints</w:t>
             </w:r>
           </w:p>
         </w:tc>
@@ -3078,7 +3078,7 @@
               <w:rPr>
                 <w:sz w:val="16"/>
               </w:rPr>
-              <w:t xml:space="preserve">En curso</w:t>
+              <w:t xml:space="preserve">Cerrado</w:t>
             </w:r>
           </w:p>
         </w:tc>
@@ -3101,7 +3101,7 @@
               <w:rPr>
                 <w:sz w:val="16"/>
               </w:rPr>
-              <w:t xml:space="preserve">8 / —</w:t>
+              <w:t xml:space="preserve">8 / 7</w:t>
             </w:r>
           </w:p>
         </w:tc>
@@ -3147,7 +3147,7 @@
               <w:rPr>
                 <w:sz w:val="16"/>
               </w:rPr>
-              <w:t xml:space="preserve">—</w:t>
+              <w:t xml:space="preserve">27</w:t>
             </w:r>
           </w:p>
         </w:tc>
@@ -3170,7 +3170,7 @@
               <w:rPr>
                 <w:sz w:val="16"/>
               </w:rPr>
-              <w:t xml:space="preserve">—</w:t>
+              <w:t xml:space="preserve">90%</w:t>
             </w:r>
           </w:p>
         </w:tc>
@@ -3193,7 +3193,7 @@
               <w:rPr>
                 <w:sz w:val="16"/>
               </w:rPr>
-              <w:t xml:space="preserve">—</w:t>
+              <w:t xml:space="preserve">130</w:t>
             </w:r>
           </w:p>
         </w:tc>
@@ -3216,7 +3216,7 @@
               <w:rPr>
                 <w:sz w:val="16"/>
               </w:rPr>
-              <w:t xml:space="preserve">—</w:t>
+              <w:t xml:space="preserve">3</w:t>
             </w:r>
           </w:p>
         </w:tc>
@@ -3290,7 +3290,7 @@
               <w:rPr>
                 <w:sz w:val="16"/>
               </w:rPr>
-              <w:t xml:space="preserve">Planificado</w:t>
+              <w:t xml:space="preserve">En curso</w:t>
             </w:r>
           </w:p>
         </w:tc>
@@ -4093,7 +4093,7 @@
                 <w:b/>
                 <w:sz w:val="16"/>
               </w:rPr>
-              <w:t xml:space="preserve">Cerrados (1–6)</w:t>
+              <w:t xml:space="preserve">Cerrados (1–7)</w:t>
             </w:r>
           </w:p>
         </w:tc>
@@ -4163,7 +4163,7 @@
                 <w:b/>
                 <w:sz w:val="16"/>
               </w:rPr>
-              <w:t xml:space="preserve">34 / 32</w:t>
+              <w:t xml:space="preserve">42 / 39</w:t>
             </w:r>
           </w:p>
         </w:tc>
@@ -4187,7 +4187,7 @@
                 <w:b/>
                 <w:sz w:val="16"/>
               </w:rPr>
-              <w:t xml:space="preserve">109</w:t>
+              <w:t xml:space="preserve">139</w:t>
             </w:r>
           </w:p>
         </w:tc>
@@ -4211,7 +4211,7 @@
                 <w:b/>
                 <w:sz w:val="16"/>
               </w:rPr>
-              <w:t xml:space="preserve">103</w:t>
+              <w:t xml:space="preserve">130</w:t>
             </w:r>
           </w:p>
         </w:tc>
@@ -4259,7 +4259,7 @@
                 <w:b/>
                 <w:sz w:val="16"/>
               </w:rPr>
-              <w:t xml:space="preserve">103</w:t>
+              <w:t xml:space="preserve">130</w:t>
             </w:r>
           </w:p>
         </w:tc>
@@ -4283,7 +4283,7 @@
                 <w:b/>
                 <w:sz w:val="16"/>
               </w:rPr>
-              <w:t xml:space="preserve">12</w:t>
+              <w:t xml:space="preserve">15</w:t>
             </w:r>
           </w:p>
         </w:tc>
@@ -4382,7 +4382,7 @@
                 <w:b/>
                 <w:sz w:val="16"/>
               </w:rPr>
-              <w:t xml:space="preserve">66 / 32</w:t>
+              <w:t xml:space="preserve">66 / 39</w:t>
             </w:r>
           </w:p>
         </w:tc>
@@ -4430,7 +4430,7 @@
                 <w:b/>
                 <w:sz w:val="16"/>
               </w:rPr>
-              <w:t xml:space="preserve">103</w:t>
+              <w:t xml:space="preserve">130</w:t>
             </w:r>
           </w:p>
         </w:tc>
@@ -4454,7 +4454,7 @@
                 <w:b/>
                 <w:sz w:val="16"/>
               </w:rPr>
-              <w:t xml:space="preserve">44%</w:t>
+              <w:t xml:space="preserve">56%</w:t>
             </w:r>
           </w:p>
         </w:tc>
@@ -4478,7 +4478,7 @@
                 <w:b/>
                 <w:sz w:val="16"/>
               </w:rPr>
-              <w:t xml:space="preserve">103</w:t>
+              <w:t xml:space="preserve">130</w:t>
             </w:r>
           </w:p>
         </w:tc>
@@ -4502,7 +4502,7 @@
                 <w:b/>
                 <w:sz w:val="16"/>
               </w:rPr>
-              <w:t xml:space="preserve">12</w:t>
+              <w:t xml:space="preserve">15</w:t>
             </w:r>
           </w:p>
         </w:tc>
@@ -4635,8 +4635,8 @@
         </w:tblCellMar>
       </w:tblPr>
       <w:tblGrid>
-        <w:gridCol w:w="5507"/>
-        <w:gridCol w:w="4130"/>
+        <w:gridCol w:w="5745"/>
+        <w:gridCol w:w="3892"/>
       </w:tblGrid>
       <w:tr>
         <w:trPr>
@@ -4645,7 +4645,7 @@
         </w:trPr>
         <w:tc>
           <w:tcPr>
-            <w:tcW w:w="5507" w:type="dxa"/>
+            <w:tcW w:w="5745" w:type="dxa"/>
             <w:tcBorders>
               <w:top w:val="single" w:sz="4" w:color="B4BFD4"/>
               <w:left w:val="single" w:sz="4" w:color="B4BFD4"/>
@@ -4670,7 +4670,7 @@
         </w:tc>
         <w:tc>
           <w:tcPr>
-            <w:tcW w:w="4130" w:type="dxa"/>
+            <w:tcW w:w="3892" w:type="dxa"/>
             <w:tcBorders>
               <w:top w:val="single" w:sz="4" w:color="B4BFD4"/>
               <w:left w:val="single" w:sz="4" w:color="B4BFD4"/>
@@ -4700,7 +4700,7 @@
         </w:trPr>
         <w:tc>
           <w:tcPr>
-            <w:tcW w:w="5507" w:type="dxa"/>
+            <w:tcW w:w="5745" w:type="dxa"/>
             <w:tcBorders>
               <w:top w:val="single" w:sz="4" w:color="B4BFD4"/>
               <w:left w:val="single" w:sz="4" w:color="B4BFD4"/>
@@ -4723,24 +4723,24 @@
         </w:tc>
         <w:tc>
           <w:tcPr>
-            <w:tcW w:w="4130" w:type="dxa"/>
-            <w:tcBorders>
-              <w:top w:val="single" w:sz="4" w:color="B4BFD4"/>
-              <w:left w:val="single" w:sz="4" w:color="B4BFD4"/>
-              <w:bottom w:val="single" w:sz="4" w:color="B4BFD4"/>
-              <w:right w:val="single" w:sz="4" w:color="B4BFD4"/>
-            </w:tcBorders>
-            <w:vAlign w:val="center"/>
-          </w:tcPr>
-          <w:p>
-            <w:pPr>
-              <w:spacing w:before="0" w:after="0" w:line="240" w:lineRule="auto"/>
-            </w:pPr>
-            <w:r>
-              <w:rPr>
-                <w:sz w:val="18"/>
-              </w:rPr>
-              <w:t xml:space="preserve">12</w:t>
+            <w:tcW w:w="3892" w:type="dxa"/>
+            <w:tcBorders>
+              <w:top w:val="single" w:sz="4" w:color="B4BFD4"/>
+              <w:left w:val="single" w:sz="4" w:color="B4BFD4"/>
+              <w:bottom w:val="single" w:sz="4" w:color="B4BFD4"/>
+              <w:right w:val="single" w:sz="4" w:color="B4BFD4"/>
+            </w:tcBorders>
+            <w:vAlign w:val="center"/>
+          </w:tcPr>
+          <w:p>
+            <w:pPr>
+              <w:spacing w:before="0" w:after="0" w:line="240" w:lineRule="auto"/>
+            </w:pPr>
+            <w:r>
+              <w:rPr>
+                <w:sz w:val="18"/>
+              </w:rPr>
+              <w:t xml:space="preserve">15</w:t>
             </w:r>
           </w:p>
         </w:tc>
@@ -4751,7 +4751,7 @@
         </w:trPr>
         <w:tc>
           <w:tcPr>
-            <w:tcW w:w="5507" w:type="dxa"/>
+            <w:tcW w:w="5745" w:type="dxa"/>
             <w:tcBorders>
               <w:top w:val="single" w:sz="4" w:color="B4BFD4"/>
               <w:left w:val="single" w:sz="4" w:color="B4BFD4"/>
@@ -4774,24 +4774,24 @@
         </w:tc>
         <w:tc>
           <w:tcPr>
-            <w:tcW w:w="4130" w:type="dxa"/>
-            <w:tcBorders>
-              <w:top w:val="single" w:sz="4" w:color="B4BFD4"/>
-              <w:left w:val="single" w:sz="4" w:color="B4BFD4"/>
-              <w:bottom w:val="single" w:sz="4" w:color="B4BFD4"/>
-              <w:right w:val="single" w:sz="4" w:color="B4BFD4"/>
-            </w:tcBorders>
-            <w:vAlign w:val="center"/>
-          </w:tcPr>
-          <w:p>
-            <w:pPr>
-              <w:spacing w:before="0" w:after="0" w:line="240" w:lineRule="auto"/>
-            </w:pPr>
-            <w:r>
-              <w:rPr>
-                <w:sz w:val="18"/>
-              </w:rPr>
-              <w:t xml:space="preserve">11 · 92%</w:t>
+            <w:tcW w:w="3892" w:type="dxa"/>
+            <w:tcBorders>
+              <w:top w:val="single" w:sz="4" w:color="B4BFD4"/>
+              <w:left w:val="single" w:sz="4" w:color="B4BFD4"/>
+              <w:bottom w:val="single" w:sz="4" w:color="B4BFD4"/>
+              <w:right w:val="single" w:sz="4" w:color="B4BFD4"/>
+            </w:tcBorders>
+            <w:vAlign w:val="center"/>
+          </w:tcPr>
+          <w:p>
+            <w:pPr>
+              <w:spacing w:before="0" w:after="0" w:line="240" w:lineRule="auto"/>
+            </w:pPr>
+            <w:r>
+              <w:rPr>
+                <w:sz w:val="18"/>
+              </w:rPr>
+              <w:t xml:space="preserve">14 · 93%</w:t>
             </w:r>
           </w:p>
         </w:tc>
@@ -4802,7 +4802,7 @@
         </w:trPr>
         <w:tc>
           <w:tcPr>
-            <w:tcW w:w="5507" w:type="dxa"/>
+            <w:tcW w:w="5745" w:type="dxa"/>
             <w:tcBorders>
               <w:top w:val="single" w:sz="4" w:color="B4BFD4"/>
               <w:left w:val="single" w:sz="4" w:color="B4BFD4"/>
@@ -4825,7 +4825,7 @@
         </w:tc>
         <w:tc>
           <w:tcPr>
-            <w:tcW w:w="4130" w:type="dxa"/>
+            <w:tcW w:w="3892" w:type="dxa"/>
             <w:tcBorders>
               <w:top w:val="single" w:sz="4" w:color="B4BFD4"/>
               <w:left w:val="single" w:sz="4" w:color="B4BFD4"/>
@@ -4853,7 +4853,7 @@
         </w:trPr>
         <w:tc>
           <w:tcPr>
-            <w:tcW w:w="5507" w:type="dxa"/>
+            <w:tcW w:w="5745" w:type="dxa"/>
             <w:tcBorders>
               <w:top w:val="single" w:sz="4" w:color="B4BFD4"/>
               <w:left w:val="single" w:sz="4" w:color="B4BFD4"/>
@@ -4876,7 +4876,7 @@
         </w:tc>
         <w:tc>
           <w:tcPr>
-            <w:tcW w:w="4130" w:type="dxa"/>
+            <w:tcW w:w="3892" w:type="dxa"/>
             <w:tcBorders>
               <w:top w:val="single" w:sz="4" w:color="B4BFD4"/>
               <w:left w:val="single" w:sz="4" w:color="B4BFD4"/>
@@ -4904,7 +4904,7 @@
         </w:trPr>
         <w:tc>
           <w:tcPr>
-            <w:tcW w:w="5507" w:type="dxa"/>
+            <w:tcW w:w="5745" w:type="dxa"/>
             <w:tcBorders>
               <w:top w:val="single" w:sz="4" w:color="B4BFD4"/>
               <w:left w:val="single" w:sz="4" w:color="B4BFD4"/>
@@ -4927,24 +4927,24 @@
         </w:tc>
         <w:tc>
           <w:tcPr>
-            <w:tcW w:w="4130" w:type="dxa"/>
-            <w:tcBorders>
-              <w:top w:val="single" w:sz="4" w:color="B4BFD4"/>
-              <w:left w:val="single" w:sz="4" w:color="B4BFD4"/>
-              <w:bottom w:val="single" w:sz="4" w:color="B4BFD4"/>
-              <w:right w:val="single" w:sz="4" w:color="B4BFD4"/>
-            </w:tcBorders>
-            <w:vAlign w:val="center"/>
-          </w:tcPr>
-          <w:p>
-            <w:pPr>
-              <w:spacing w:before="0" w:after="0" w:line="240" w:lineRule="auto"/>
-            </w:pPr>
-            <w:r>
-              <w:rPr>
-                <w:sz w:val="18"/>
-              </w:rPr>
-              <w:t xml:space="preserve">0,12 por SP entregado</w:t>
+            <w:tcW w:w="3892" w:type="dxa"/>
+            <w:tcBorders>
+              <w:top w:val="single" w:sz="4" w:color="B4BFD4"/>
+              <w:left w:val="single" w:sz="4" w:color="B4BFD4"/>
+              <w:bottom w:val="single" w:sz="4" w:color="B4BFD4"/>
+              <w:right w:val="single" w:sz="4" w:color="B4BFD4"/>
+            </w:tcBorders>
+            <w:vAlign w:val="center"/>
+          </w:tcPr>
+          <w:p>
+            <w:pPr>
+              <w:spacing w:before="0" w:after="0" w:line="240" w:lineRule="auto"/>
+            </w:pPr>
+            <w:r>
+              <w:rPr>
+                <w:sz w:val="18"/>
+              </w:rPr>
+              <w:t xml:space="preserve">0,11 por SP entregado</w:t>
             </w:r>
           </w:p>
         </w:tc>
@@ -4955,47 +4955,47 @@
         </w:trPr>
         <w:tc>
           <w:tcPr>
-            <w:tcW w:w="5507" w:type="dxa"/>
-            <w:tcBorders>
-              <w:top w:val="single" w:sz="4" w:color="B4BFD4"/>
-              <w:left w:val="single" w:sz="4" w:color="B4BFD4"/>
-              <w:bottom w:val="single" w:sz="4" w:color="B4BFD4"/>
-              <w:right w:val="single" w:sz="4" w:color="B4BFD4"/>
-            </w:tcBorders>
-            <w:vAlign w:val="center"/>
-          </w:tcPr>
-          <w:p>
-            <w:pPr>
-              <w:spacing w:before="0" w:after="0" w:line="240" w:lineRule="auto"/>
-            </w:pPr>
-            <w:r>
-              <w:rPr>
-                <w:sz w:val="18"/>
-              </w:rPr>
-              <w:t xml:space="preserve">Defectos de seguridad</w:t>
-            </w:r>
-          </w:p>
-        </w:tc>
-        <w:tc>
-          <w:tcPr>
-            <w:tcW w:w="4130" w:type="dxa"/>
-            <w:tcBorders>
-              <w:top w:val="single" w:sz="4" w:color="B4BFD4"/>
-              <w:left w:val="single" w:sz="4" w:color="B4BFD4"/>
-              <w:bottom w:val="single" w:sz="4" w:color="B4BFD4"/>
-              <w:right w:val="single" w:sz="4" w:color="B4BFD4"/>
-            </w:tcBorders>
-            <w:vAlign w:val="center"/>
-          </w:tcPr>
-          <w:p>
-            <w:pPr>
-              <w:spacing w:before="0" w:after="0" w:line="240" w:lineRule="auto"/>
-            </w:pPr>
-            <w:r>
-              <w:rPr>
-                <w:sz w:val="18"/>
-              </w:rPr>
-              <w:t xml:space="preserve">5 de 12 · 42%</w:t>
+            <w:tcW w:w="5745" w:type="dxa"/>
+            <w:tcBorders>
+              <w:top w:val="single" w:sz="4" w:color="B4BFD4"/>
+              <w:left w:val="single" w:sz="4" w:color="B4BFD4"/>
+              <w:bottom w:val="single" w:sz="4" w:color="B4BFD4"/>
+              <w:right w:val="single" w:sz="4" w:color="B4BFD4"/>
+            </w:tcBorders>
+            <w:vAlign w:val="center"/>
+          </w:tcPr>
+          <w:p>
+            <w:pPr>
+              <w:spacing w:before="0" w:after="0" w:line="240" w:lineRule="auto"/>
+            </w:pPr>
+            <w:r>
+              <w:rPr>
+                <w:sz w:val="18"/>
+              </w:rPr>
+              <w:t xml:space="preserve">Defectos de integración (merge)</w:t>
+            </w:r>
+          </w:p>
+        </w:tc>
+        <w:tc>
+          <w:tcPr>
+            <w:tcW w:w="3892" w:type="dxa"/>
+            <w:tcBorders>
+              <w:top w:val="single" w:sz="4" w:color="B4BFD4"/>
+              <w:left w:val="single" w:sz="4" w:color="B4BFD4"/>
+              <w:bottom w:val="single" w:sz="4" w:color="B4BFD4"/>
+              <w:right w:val="single" w:sz="4" w:color="B4BFD4"/>
+            </w:tcBorders>
+            <w:vAlign w:val="center"/>
+          </w:tcPr>
+          <w:p>
+            <w:pPr>
+              <w:spacing w:before="0" w:after="0" w:line="240" w:lineRule="auto"/>
+            </w:pPr>
+            <w:r>
+              <w:rPr>
+                <w:sz w:val="18"/>
+              </w:rPr>
+              <w:t xml:space="preserve">3 de 15 · 20%</w:t>
             </w:r>
           </w:p>
         </w:tc>
@@ -5006,47 +5006,47 @@
         </w:trPr>
         <w:tc>
           <w:tcPr>
-            <w:tcW w:w="5507" w:type="dxa"/>
-            <w:tcBorders>
-              <w:top w:val="single" w:sz="4" w:color="B4BFD4"/>
-              <w:left w:val="single" w:sz="4" w:color="B4BFD4"/>
-              <w:bottom w:val="single" w:sz="4" w:color="B4BFD4"/>
-              <w:right w:val="single" w:sz="4" w:color="B4BFD4"/>
-            </w:tcBorders>
-            <w:vAlign w:val="center"/>
-          </w:tcPr>
-          <w:p>
-            <w:pPr>
-              <w:spacing w:before="0" w:after="0" w:line="240" w:lineRule="auto"/>
-            </w:pPr>
-            <w:r>
-              <w:rPr>
-                <w:sz w:val="18"/>
-              </w:rPr>
-              <w:t xml:space="preserve">Sprint con más defectos</w:t>
-            </w:r>
-          </w:p>
-        </w:tc>
-        <w:tc>
-          <w:tcPr>
-            <w:tcW w:w="4130" w:type="dxa"/>
-            <w:tcBorders>
-              <w:top w:val="single" w:sz="4" w:color="B4BFD4"/>
-              <w:left w:val="single" w:sz="4" w:color="B4BFD4"/>
-              <w:bottom w:val="single" w:sz="4" w:color="B4BFD4"/>
-              <w:right w:val="single" w:sz="4" w:color="B4BFD4"/>
-            </w:tcBorders>
-            <w:vAlign w:val="center"/>
-          </w:tcPr>
-          <w:p>
-            <w:pPr>
-              <w:spacing w:before="0" w:after="0" w:line="240" w:lineRule="auto"/>
-            </w:pPr>
-            <w:r>
-              <w:rPr>
-                <w:sz w:val="18"/>
-              </w:rPr>
-              <w:t xml:space="preserve">Sprint 6 · 4</w:t>
+            <w:tcW w:w="5745" w:type="dxa"/>
+            <w:tcBorders>
+              <w:top w:val="single" w:sz="4" w:color="B4BFD4"/>
+              <w:left w:val="single" w:sz="4" w:color="B4BFD4"/>
+              <w:bottom w:val="single" w:sz="4" w:color="B4BFD4"/>
+              <w:right w:val="single" w:sz="4" w:color="B4BFD4"/>
+            </w:tcBorders>
+            <w:vAlign w:val="center"/>
+          </w:tcPr>
+          <w:p>
+            <w:pPr>
+              <w:spacing w:before="0" w:after="0" w:line="240" w:lineRule="auto"/>
+            </w:pPr>
+            <w:r>
+              <w:rPr>
+                <w:sz w:val="18"/>
+              </w:rPr>
+              <w:t xml:space="preserve">Defectos de seguridad</w:t>
+            </w:r>
+          </w:p>
+        </w:tc>
+        <w:tc>
+          <w:tcPr>
+            <w:tcW w:w="3892" w:type="dxa"/>
+            <w:tcBorders>
+              <w:top w:val="single" w:sz="4" w:color="B4BFD4"/>
+              <w:left w:val="single" w:sz="4" w:color="B4BFD4"/>
+              <w:bottom w:val="single" w:sz="4" w:color="B4BFD4"/>
+              <w:right w:val="single" w:sz="4" w:color="B4BFD4"/>
+            </w:tcBorders>
+            <w:vAlign w:val="center"/>
+          </w:tcPr>
+          <w:p>
+            <w:pPr>
+              <w:spacing w:before="0" w:after="0" w:line="240" w:lineRule="auto"/>
+            </w:pPr>
+            <w:r>
+              <w:rPr>
+                <w:sz w:val="18"/>
+              </w:rPr>
+              <w:t xml:space="preserve">5 de 15 · 33%</w:t>
             </w:r>
           </w:p>
         </w:tc>
@@ -5057,7 +5057,58 @@
         </w:trPr>
         <w:tc>
           <w:tcPr>
-            <w:tcW w:w="5507" w:type="dxa"/>
+            <w:tcW w:w="5745" w:type="dxa"/>
+            <w:tcBorders>
+              <w:top w:val="single" w:sz="4" w:color="B4BFD4"/>
+              <w:left w:val="single" w:sz="4" w:color="B4BFD4"/>
+              <w:bottom w:val="single" w:sz="4" w:color="B4BFD4"/>
+              <w:right w:val="single" w:sz="4" w:color="B4BFD4"/>
+            </w:tcBorders>
+            <w:vAlign w:val="center"/>
+          </w:tcPr>
+          <w:p>
+            <w:pPr>
+              <w:spacing w:before="0" w:after="0" w:line="240" w:lineRule="auto"/>
+            </w:pPr>
+            <w:r>
+              <w:rPr>
+                <w:sz w:val="18"/>
+              </w:rPr>
+              <w:t xml:space="preserve">Sprint con más defectos</w:t>
+            </w:r>
+          </w:p>
+        </w:tc>
+        <w:tc>
+          <w:tcPr>
+            <w:tcW w:w="3892" w:type="dxa"/>
+            <w:tcBorders>
+              <w:top w:val="single" w:sz="4" w:color="B4BFD4"/>
+              <w:left w:val="single" w:sz="4" w:color="B4BFD4"/>
+              <w:bottom w:val="single" w:sz="4" w:color="B4BFD4"/>
+              <w:right w:val="single" w:sz="4" w:color="B4BFD4"/>
+            </w:tcBorders>
+            <w:vAlign w:val="center"/>
+          </w:tcPr>
+          <w:p>
+            <w:pPr>
+              <w:spacing w:before="0" w:after="0" w:line="240" w:lineRule="auto"/>
+            </w:pPr>
+            <w:r>
+              <w:rPr>
+                <w:sz w:val="18"/>
+              </w:rPr>
+              <w:t xml:space="preserve">Sprint 6 · 4</w:t>
+            </w:r>
+          </w:p>
+        </w:tc>
+      </w:tr>
+      <w:tr>
+        <w:trPr>
+          <w:cantSplit/>
+        </w:trPr>
+        <w:tc>
+          <w:tcPr>
+            <w:tcW w:w="5745" w:type="dxa"/>
             <w:tcBorders>
               <w:top w:val="single" w:sz="4" w:color="B4BFD4"/>
               <w:left w:val="single" w:sz="4" w:color="B4BFD4"/>
@@ -5080,24 +5131,24 @@
         </w:tc>
         <w:tc>
           <w:tcPr>
-            <w:tcW w:w="4130" w:type="dxa"/>
-            <w:tcBorders>
-              <w:top w:val="single" w:sz="4" w:color="B4BFD4"/>
-              <w:left w:val="single" w:sz="4" w:color="B4BFD4"/>
-              <w:bottom w:val="single" w:sz="4" w:color="B4BFD4"/>
-              <w:right w:val="single" w:sz="4" w:color="B4BFD4"/>
-            </w:tcBorders>
-            <w:vAlign w:val="center"/>
-          </w:tcPr>
-          <w:p>
-            <w:pPr>
-              <w:spacing w:before="0" w:after="0" w:line="240" w:lineRule="auto"/>
-            </w:pPr>
-            <w:r>
-              <w:rPr>
-                <w:sz w:val="18"/>
-              </w:rPr>
-              <w:t xml:space="preserve">11 de 12 · 92%</w:t>
+            <w:tcW w:w="3892" w:type="dxa"/>
+            <w:tcBorders>
+              <w:top w:val="single" w:sz="4" w:color="B4BFD4"/>
+              <w:left w:val="single" w:sz="4" w:color="B4BFD4"/>
+              <w:bottom w:val="single" w:sz="4" w:color="B4BFD4"/>
+              <w:right w:val="single" w:sz="4" w:color="B4BFD4"/>
+            </w:tcBorders>
+            <w:vAlign w:val="center"/>
+          </w:tcPr>
+          <w:p>
+            <w:pPr>
+              <w:spacing w:before="0" w:after="0" w:line="240" w:lineRule="auto"/>
+            </w:pPr>
+            <w:r>
+              <w:rPr>
+                <w:sz w:val="18"/>
+              </w:rPr>
+              <w:t xml:space="preserve">14 de 15 · 93%</w:t>
             </w:r>
           </w:p>
         </w:tc>
@@ -6768,6 +6819,366 @@
           </w:p>
         </w:tc>
       </w:tr>
+      <w:tr>
+        <w:trPr>
+          <w:cantSplit/>
+        </w:trPr>
+        <w:tc>
+          <w:tcPr>
+            <w:tcW w:w="560" w:type="dxa"/>
+            <w:tcBorders>
+              <w:top w:val="single" w:sz="4" w:color="B4BFD4"/>
+              <w:left w:val="single" w:sz="4" w:color="B4BFD4"/>
+              <w:bottom w:val="single" w:sz="4" w:color="B4BFD4"/>
+              <w:right w:val="single" w:sz="4" w:color="B4BFD4"/>
+            </w:tcBorders>
+            <w:vAlign w:val="center"/>
+          </w:tcPr>
+          <w:p>
+            <w:pPr>
+              <w:spacing w:before="0" w:after="0" w:line="240" w:lineRule="auto"/>
+            </w:pPr>
+            <w:r>
+              <w:rPr>
+                <w:sz w:val="18"/>
+              </w:rPr>
+              <w:t xml:space="preserve">B-13</w:t>
+            </w:r>
+          </w:p>
+        </w:tc>
+        <w:tc>
+          <w:tcPr>
+            <w:tcW w:w="760" w:type="dxa"/>
+            <w:tcBorders>
+              <w:top w:val="single" w:sz="4" w:color="B4BFD4"/>
+              <w:left w:val="single" w:sz="4" w:color="B4BFD4"/>
+              <w:bottom w:val="single" w:sz="4" w:color="B4BFD4"/>
+              <w:right w:val="single" w:sz="4" w:color="B4BFD4"/>
+            </w:tcBorders>
+            <w:vAlign w:val="center"/>
+          </w:tcPr>
+          <w:p>
+            <w:pPr>
+              <w:spacing w:before="0" w:after="0" w:line="240" w:lineRule="auto"/>
+            </w:pPr>
+            <w:r>
+              <w:rPr>
+                <w:sz w:val="18"/>
+              </w:rPr>
+              <w:t xml:space="preserve">7</w:t>
+            </w:r>
+          </w:p>
+        </w:tc>
+        <w:tc>
+          <w:tcPr>
+            <w:tcW w:w="5656" w:type="dxa"/>
+            <w:tcBorders>
+              <w:top w:val="single" w:sz="4" w:color="B4BFD4"/>
+              <w:left w:val="single" w:sz="4" w:color="B4BFD4"/>
+              <w:bottom w:val="single" w:sz="4" w:color="B4BFD4"/>
+              <w:right w:val="single" w:sz="4" w:color="B4BFD4"/>
+            </w:tcBorders>
+            <w:vAlign w:val="center"/>
+          </w:tcPr>
+          <w:p>
+            <w:pPr>
+              <w:spacing w:before="0" w:after="0" w:line="240" w:lineRule="auto"/>
+            </w:pPr>
+            <w:r>
+              <w:rPr>
+                <w:sz w:val="18"/>
+              </w:rPr>
+              <w:t xml:space="preserve">Al mergear las ramas de entregas y de gamificación se perdió el registro de las rutas de entregas y los endpoints respondían 404.</w:t>
+            </w:r>
+          </w:p>
+        </w:tc>
+        <w:tc>
+          <w:tcPr>
+            <w:tcW w:w="1648" w:type="dxa"/>
+            <w:tcBorders>
+              <w:top w:val="single" w:sz="4" w:color="B4BFD4"/>
+              <w:left w:val="single" w:sz="4" w:color="B4BFD4"/>
+              <w:bottom w:val="single" w:sz="4" w:color="B4BFD4"/>
+              <w:right w:val="single" w:sz="4" w:color="B4BFD4"/>
+            </w:tcBorders>
+            <w:vAlign w:val="center"/>
+          </w:tcPr>
+          <w:p>
+            <w:pPr>
+              <w:spacing w:before="0" w:after="0" w:line="240" w:lineRule="auto"/>
+            </w:pPr>
+            <w:r>
+              <w:rPr>
+                <w:sz w:val="18"/>
+              </w:rPr>
+              <w:t xml:space="preserve">Merge</w:t>
+            </w:r>
+          </w:p>
+        </w:tc>
+        <w:tc>
+          <w:tcPr>
+            <w:tcW w:w="1014" w:type="dxa"/>
+            <w:tcBorders>
+              <w:top w:val="single" w:sz="4" w:color="B4BFD4"/>
+              <w:left w:val="single" w:sz="4" w:color="B4BFD4"/>
+              <w:bottom w:val="single" w:sz="4" w:color="B4BFD4"/>
+              <w:right w:val="single" w:sz="4" w:color="B4BFD4"/>
+            </w:tcBorders>
+            <w:vAlign w:val="center"/>
+          </w:tcPr>
+          <w:p>
+            <w:pPr>
+              <w:spacing w:before="0" w:after="0" w:line="240" w:lineRule="auto"/>
+            </w:pPr>
+            <w:r>
+              <w:rPr>
+                <w:sz w:val="18"/>
+              </w:rPr>
+              <w:t xml:space="preserve">Resuelto</w:t>
+            </w:r>
+          </w:p>
+        </w:tc>
+      </w:tr>
+      <w:tr>
+        <w:trPr>
+          <w:cantSplit/>
+        </w:trPr>
+        <w:tc>
+          <w:tcPr>
+            <w:tcW w:w="560" w:type="dxa"/>
+            <w:tcBorders>
+              <w:top w:val="single" w:sz="4" w:color="B4BFD4"/>
+              <w:left w:val="single" w:sz="4" w:color="B4BFD4"/>
+              <w:bottom w:val="single" w:sz="4" w:color="B4BFD4"/>
+              <w:right w:val="single" w:sz="4" w:color="B4BFD4"/>
+            </w:tcBorders>
+            <w:vAlign w:val="center"/>
+          </w:tcPr>
+          <w:p>
+            <w:pPr>
+              <w:spacing w:before="0" w:after="0" w:line="240" w:lineRule="auto"/>
+            </w:pPr>
+            <w:r>
+              <w:rPr>
+                <w:sz w:val="18"/>
+              </w:rPr>
+              <w:t xml:space="preserve">B-14</w:t>
+            </w:r>
+          </w:p>
+        </w:tc>
+        <w:tc>
+          <w:tcPr>
+            <w:tcW w:w="760" w:type="dxa"/>
+            <w:tcBorders>
+              <w:top w:val="single" w:sz="4" w:color="B4BFD4"/>
+              <w:left w:val="single" w:sz="4" w:color="B4BFD4"/>
+              <w:bottom w:val="single" w:sz="4" w:color="B4BFD4"/>
+              <w:right w:val="single" w:sz="4" w:color="B4BFD4"/>
+            </w:tcBorders>
+            <w:vAlign w:val="center"/>
+          </w:tcPr>
+          <w:p>
+            <w:pPr>
+              <w:spacing w:before="0" w:after="0" w:line="240" w:lineRule="auto"/>
+            </w:pPr>
+            <w:r>
+              <w:rPr>
+                <w:sz w:val="18"/>
+              </w:rPr>
+              <w:t xml:space="preserve">7</w:t>
+            </w:r>
+          </w:p>
+        </w:tc>
+        <w:tc>
+          <w:tcPr>
+            <w:tcW w:w="5656" w:type="dxa"/>
+            <w:tcBorders>
+              <w:top w:val="single" w:sz="4" w:color="B4BFD4"/>
+              <w:left w:val="single" w:sz="4" w:color="B4BFD4"/>
+              <w:bottom w:val="single" w:sz="4" w:color="B4BFD4"/>
+              <w:right w:val="single" w:sz="4" w:color="B4BFD4"/>
+            </w:tcBorders>
+            <w:vAlign w:val="center"/>
+          </w:tcPr>
+          <w:p>
+            <w:pPr>
+              <w:spacing w:before="0" w:after="0" w:line="240" w:lineRule="auto"/>
+            </w:pPr>
+            <w:r>
+              <w:rPr>
+                <w:sz w:val="18"/>
+              </w:rPr>
+              <w:t xml:space="preserve">La resolución de un conflicto en el esquema de la base dejó duplicada la definición de logros y el script de creación fallaba.</w:t>
+            </w:r>
+          </w:p>
+        </w:tc>
+        <w:tc>
+          <w:tcPr>
+            <w:tcW w:w="1648" w:type="dxa"/>
+            <w:tcBorders>
+              <w:top w:val="single" w:sz="4" w:color="B4BFD4"/>
+              <w:left w:val="single" w:sz="4" w:color="B4BFD4"/>
+              <w:bottom w:val="single" w:sz="4" w:color="B4BFD4"/>
+              <w:right w:val="single" w:sz="4" w:color="B4BFD4"/>
+            </w:tcBorders>
+            <w:vAlign w:val="center"/>
+          </w:tcPr>
+          <w:p>
+            <w:pPr>
+              <w:spacing w:before="0" w:after="0" w:line="240" w:lineRule="auto"/>
+            </w:pPr>
+            <w:r>
+              <w:rPr>
+                <w:sz w:val="18"/>
+              </w:rPr>
+              <w:t xml:space="preserve">Merge</w:t>
+            </w:r>
+          </w:p>
+        </w:tc>
+        <w:tc>
+          <w:tcPr>
+            <w:tcW w:w="1014" w:type="dxa"/>
+            <w:tcBorders>
+              <w:top w:val="single" w:sz="4" w:color="B4BFD4"/>
+              <w:left w:val="single" w:sz="4" w:color="B4BFD4"/>
+              <w:bottom w:val="single" w:sz="4" w:color="B4BFD4"/>
+              <w:right w:val="single" w:sz="4" w:color="B4BFD4"/>
+            </w:tcBorders>
+            <w:vAlign w:val="center"/>
+          </w:tcPr>
+          <w:p>
+            <w:pPr>
+              <w:spacing w:before="0" w:after="0" w:line="240" w:lineRule="auto"/>
+            </w:pPr>
+            <w:r>
+              <w:rPr>
+                <w:sz w:val="18"/>
+              </w:rPr>
+              <w:t xml:space="preserve">Resuelto</w:t>
+            </w:r>
+          </w:p>
+        </w:tc>
+      </w:tr>
+      <w:tr>
+        <w:trPr>
+          <w:cantSplit/>
+        </w:trPr>
+        <w:tc>
+          <w:tcPr>
+            <w:tcW w:w="560" w:type="dxa"/>
+            <w:tcBorders>
+              <w:top w:val="single" w:sz="4" w:color="B4BFD4"/>
+              <w:left w:val="single" w:sz="4" w:color="B4BFD4"/>
+              <w:bottom w:val="single" w:sz="4" w:color="B4BFD4"/>
+              <w:right w:val="single" w:sz="4" w:color="B4BFD4"/>
+            </w:tcBorders>
+            <w:vAlign w:val="center"/>
+          </w:tcPr>
+          <w:p>
+            <w:pPr>
+              <w:spacing w:before="0" w:after="0" w:line="240" w:lineRule="auto"/>
+            </w:pPr>
+            <w:r>
+              <w:rPr>
+                <w:sz w:val="18"/>
+              </w:rPr>
+              <w:t xml:space="preserve">B-15</w:t>
+            </w:r>
+          </w:p>
+        </w:tc>
+        <w:tc>
+          <w:tcPr>
+            <w:tcW w:w="760" w:type="dxa"/>
+            <w:tcBorders>
+              <w:top w:val="single" w:sz="4" w:color="B4BFD4"/>
+              <w:left w:val="single" w:sz="4" w:color="B4BFD4"/>
+              <w:bottom w:val="single" w:sz="4" w:color="B4BFD4"/>
+              <w:right w:val="single" w:sz="4" w:color="B4BFD4"/>
+            </w:tcBorders>
+            <w:vAlign w:val="center"/>
+          </w:tcPr>
+          <w:p>
+            <w:pPr>
+              <w:spacing w:before="0" w:after="0" w:line="240" w:lineRule="auto"/>
+            </w:pPr>
+            <w:r>
+              <w:rPr>
+                <w:sz w:val="18"/>
+              </w:rPr>
+              <w:t xml:space="preserve">7</w:t>
+            </w:r>
+          </w:p>
+        </w:tc>
+        <w:tc>
+          <w:tcPr>
+            <w:tcW w:w="5656" w:type="dxa"/>
+            <w:tcBorders>
+              <w:top w:val="single" w:sz="4" w:color="B4BFD4"/>
+              <w:left w:val="single" w:sz="4" w:color="B4BFD4"/>
+              <w:bottom w:val="single" w:sz="4" w:color="B4BFD4"/>
+              <w:right w:val="single" w:sz="4" w:color="B4BFD4"/>
+            </w:tcBorders>
+            <w:vAlign w:val="center"/>
+          </w:tcPr>
+          <w:p>
+            <w:pPr>
+              <w:spacing w:before="0" w:after="0" w:line="240" w:lineRule="auto"/>
+            </w:pPr>
+            <w:r>
+              <w:rPr>
+                <w:sz w:val="18"/>
+              </w:rPr>
+              <w:t xml:space="preserve">Un merge en la documentación de la API pisó los endpoints de material de apoyo, que dejaron de aparecer en Swagger.</w:t>
+            </w:r>
+          </w:p>
+        </w:tc>
+        <w:tc>
+          <w:tcPr>
+            <w:tcW w:w="1648" w:type="dxa"/>
+            <w:tcBorders>
+              <w:top w:val="single" w:sz="4" w:color="B4BFD4"/>
+              <w:left w:val="single" w:sz="4" w:color="B4BFD4"/>
+              <w:bottom w:val="single" w:sz="4" w:color="B4BFD4"/>
+              <w:right w:val="single" w:sz="4" w:color="B4BFD4"/>
+            </w:tcBorders>
+            <w:vAlign w:val="center"/>
+          </w:tcPr>
+          <w:p>
+            <w:pPr>
+              <w:spacing w:before="0" w:after="0" w:line="240" w:lineRule="auto"/>
+            </w:pPr>
+            <w:r>
+              <w:rPr>
+                <w:sz w:val="18"/>
+              </w:rPr>
+              <w:t xml:space="preserve">Merge</w:t>
+            </w:r>
+          </w:p>
+        </w:tc>
+        <w:tc>
+          <w:tcPr>
+            <w:tcW w:w="1014" w:type="dxa"/>
+            <w:tcBorders>
+              <w:top w:val="single" w:sz="4" w:color="B4BFD4"/>
+              <w:left w:val="single" w:sz="4" w:color="B4BFD4"/>
+              <w:bottom w:val="single" w:sz="4" w:color="B4BFD4"/>
+              <w:right w:val="single" w:sz="4" w:color="B4BFD4"/>
+            </w:tcBorders>
+            <w:vAlign w:val="center"/>
+          </w:tcPr>
+          <w:p>
+            <w:pPr>
+              <w:spacing w:before="0" w:after="0" w:line="240" w:lineRule="auto"/>
+            </w:pPr>
+            <w:r>
+              <w:rPr>
+                <w:sz w:val="18"/>
+              </w:rPr>
+              <w:t xml:space="preserve">Resuelto</w:t>
+            </w:r>
+          </w:p>
+        </w:tc>
+      </w:tr>
     </w:tbl>
     <w:p/>
     <w:p>
@@ -7735,7 +8146,7 @@
               <w:rPr>
                 <w:sz w:val="18"/>
               </w:rPr>
-              <w:t xml:space="preserve">Completo</w:t>
+              <w:t xml:space="preserve">Parcial</w:t>
             </w:r>
           </w:p>
         </w:tc>
@@ -7758,7 +8169,7 @@
               <w:rPr>
                 <w:sz w:val="18"/>
               </w:rPr>
-              <w:t xml:space="preserve">—</w:t>
+              <w:t xml:space="preserve">Se calcula y se guarda (HU-058); falta mostrarla en la interfaz</w:t>
             </w:r>
           </w:p>
         </w:tc>
@@ -7832,7 +8243,7 @@
               <w:rPr>
                 <w:sz w:val="18"/>
               </w:rPr>
-              <w:t xml:space="preserve">Desbloqueo automático (HU-061), ver mis logros (HU-062)</w:t>
+              <w:t xml:space="preserve">Se crean al dar de alta un curso (HU-059); falta el desbloqueo automático (HU-061) y ver mis logros (HU-062)</w:t>
             </w:r>
           </w:p>
         </w:tc>

</xml_diff>

<commit_message>
feat: update project KPIs and sprint review documentation, enhance level management SQL schema, and remove obsolete SQL script
</commit_message>
<xml_diff>
--- a/docs/Informe general de avance.docx
+++ b/docs/Informe general de avance.docx
@@ -441,7 +441,7 @@
               <w:rPr>
                 <w:sz w:val="18"/>
               </w:rPr>
-              <w:t xml:space="preserve">232 SP · 66 historias</w:t>
+              <w:t xml:space="preserve">235 SP · 67 historias</w:t>
             </w:r>
           </w:p>
         </w:tc>
@@ -492,7 +492,7 @@
               <w:rPr>
                 <w:sz w:val="18"/>
               </w:rPr>
-              <w:t xml:space="preserve">HU-034 y HU-036 (6 SP) se pronosticaron en el sprint 5 y, al no cerrar, otra vez en el 6</w:t>
+              <w:t xml:space="preserve">HU-034 y HU-036 (6 SP) se pronosticaron en los sprints 5 y 6, y HU-058 (3 SP) en los sprints 7 y 8, porque no cerraron en el primero</w:t>
             </w:r>
           </w:p>
         </w:tc>
@@ -594,7 +594,7 @@
               <w:rPr>
                 <w:sz w:val="18"/>
               </w:rPr>
-              <w:t xml:space="preserve">Sprint 7 · 9/10 – 16/10</w:t>
+              <w:t xml:space="preserve">Sprint 8 · 16/10 – 23/10</w:t>
             </w:r>
           </w:p>
         </w:tc>
@@ -645,7 +645,7 @@
               <w:rPr>
                 <w:sz w:val="18"/>
               </w:rPr>
-              <w:t xml:space="preserve">Sprint 8 · 16/10 – 23/10</w:t>
+              <w:t xml:space="preserve">Sprint 9 · 23/10 – 30/10</w:t>
             </w:r>
           </w:p>
         </w:tc>
@@ -854,7 +854,7 @@
               <w:rPr>
                 <w:sz w:val="18"/>
               </w:rPr>
-              <w:t xml:space="preserve">7 de 11</w:t>
+              <w:t xml:space="preserve">8 de 11</w:t>
             </w:r>
           </w:p>
         </w:tc>
@@ -928,7 +928,7 @@
               <w:rPr>
                 <w:sz w:val="18"/>
               </w:rPr>
-              <w:t xml:space="preserve">130 de 226 SP · 58%</w:t>
+              <w:t xml:space="preserve">154 de 226 SP · 68%</w:t>
             </w:r>
           </w:p>
         </w:tc>
@@ -1002,7 +1002,7 @@
               <w:rPr>
                 <w:sz w:val="18"/>
               </w:rPr>
-              <w:t xml:space="preserve">39 de 42 comprometidas · 93%</w:t>
+              <w:t xml:space="preserve">45 de 49 comprometidas · 92%</w:t>
             </w:r>
           </w:p>
         </w:tc>
@@ -1076,7 +1076,7 @@
               <w:rPr>
                 <w:sz w:val="18"/>
               </w:rPr>
-              <w:t xml:space="preserve">18,6 SP</w:t>
+              <w:t xml:space="preserve">19,3 SP</w:t>
             </w:r>
           </w:p>
         </w:tc>
@@ -1150,7 +1150,7 @@
               <w:rPr>
                 <w:sz w:val="18"/>
               </w:rPr>
-              <w:t xml:space="preserve">23,0 SP</w:t>
+              <w:t xml:space="preserve">26,7 SP</w:t>
             </w:r>
           </w:p>
         </w:tc>
@@ -1224,7 +1224,7 @@
               <w:rPr>
                 <w:sz w:val="18"/>
               </w:rPr>
-              <w:t xml:space="preserve">94% · 130 de 139 SP</w:t>
+              <w:t xml:space="preserve">92% · 154 de 168 SP</w:t>
             </w:r>
           </w:p>
         </w:tc>
@@ -1298,7 +1298,7 @@
               <w:rPr>
                 <w:sz w:val="18"/>
               </w:rPr>
-              <w:t xml:space="preserve">5 de 7 · 71%</w:t>
+              <w:t xml:space="preserve">5 de 8 · 63%</w:t>
             </w:r>
           </w:p>
         </w:tc>
@@ -1372,7 +1372,7 @@
               <w:rPr>
                 <w:sz w:val="18"/>
               </w:rPr>
-              <w:t xml:space="preserve">Sprint 7 · 30 SP</w:t>
+              <w:t xml:space="preserve">Sprint 6 · 29 SP</w:t>
             </w:r>
           </w:p>
         </w:tc>
@@ -1446,7 +1446,7 @@
               <w:rPr>
                 <w:sz w:val="18"/>
               </w:rPr>
-              <w:t xml:space="preserve">96 en 4 sprints</w:t>
+              <w:t xml:space="preserve">72 en 3 sprints</w:t>
             </w:r>
           </w:p>
         </w:tc>
@@ -3290,7 +3290,7 @@
               <w:rPr>
                 <w:sz w:val="16"/>
               </w:rPr>
-              <w:t xml:space="preserve">En curso</w:t>
+              <w:t xml:space="preserve">Cerrado</w:t>
             </w:r>
           </w:p>
         </w:tc>
@@ -3313,7 +3313,7 @@
               <w:rPr>
                 <w:sz w:val="16"/>
               </w:rPr>
-              <w:t xml:space="preserve">6 / —</w:t>
+              <w:t xml:space="preserve">7 / 6</w:t>
             </w:r>
           </w:p>
         </w:tc>
@@ -3336,7 +3336,7 @@
               <w:rPr>
                 <w:sz w:val="16"/>
               </w:rPr>
-              <w:t xml:space="preserve">26</w:t>
+              <w:t xml:space="preserve">29</w:t>
             </w:r>
           </w:p>
         </w:tc>
@@ -3359,7 +3359,7 @@
               <w:rPr>
                 <w:sz w:val="16"/>
               </w:rPr>
-              <w:t xml:space="preserve">—</w:t>
+              <w:t xml:space="preserve">24</w:t>
             </w:r>
           </w:p>
         </w:tc>
@@ -3382,7 +3382,7 @@
               <w:rPr>
                 <w:sz w:val="16"/>
               </w:rPr>
-              <w:t xml:space="preserve">—</w:t>
+              <w:t xml:space="preserve">83%</w:t>
             </w:r>
           </w:p>
         </w:tc>
@@ -3405,7 +3405,7 @@
               <w:rPr>
                 <w:sz w:val="16"/>
               </w:rPr>
-              <w:t xml:space="preserve">—</w:t>
+              <w:t xml:space="preserve">154</w:t>
             </w:r>
           </w:p>
         </w:tc>
@@ -3428,7 +3428,7 @@
               <w:rPr>
                 <w:sz w:val="16"/>
               </w:rPr>
-              <w:t xml:space="preserve">—</w:t>
+              <w:t xml:space="preserve">4</w:t>
             </w:r>
           </w:p>
         </w:tc>
@@ -3502,7 +3502,7 @@
               <w:rPr>
                 <w:sz w:val="16"/>
               </w:rPr>
-              <w:t xml:space="preserve">Planificado</w:t>
+              <w:t xml:space="preserve">En curso</w:t>
             </w:r>
           </w:p>
         </w:tc>
@@ -4093,7 +4093,7 @@
                 <w:b/>
                 <w:sz w:val="16"/>
               </w:rPr>
-              <w:t xml:space="preserve">Cerrados (1–7)</w:t>
+              <w:t xml:space="preserve">Cerrados (1–8)</w:t>
             </w:r>
           </w:p>
         </w:tc>
@@ -4163,7 +4163,7 @@
                 <w:b/>
                 <w:sz w:val="16"/>
               </w:rPr>
-              <w:t xml:space="preserve">42 / 39</w:t>
+              <w:t xml:space="preserve">49 / 45</w:t>
             </w:r>
           </w:p>
         </w:tc>
@@ -4187,7 +4187,7 @@
                 <w:b/>
                 <w:sz w:val="16"/>
               </w:rPr>
-              <w:t xml:space="preserve">139</w:t>
+              <w:t xml:space="preserve">168</w:t>
             </w:r>
           </w:p>
         </w:tc>
@@ -4211,7 +4211,7 @@
                 <w:b/>
                 <w:sz w:val="16"/>
               </w:rPr>
-              <w:t xml:space="preserve">130</w:t>
+              <w:t xml:space="preserve">154</w:t>
             </w:r>
           </w:p>
         </w:tc>
@@ -4235,7 +4235,7 @@
                 <w:b/>
                 <w:sz w:val="16"/>
               </w:rPr>
-              <w:t xml:space="preserve">94%</w:t>
+              <w:t xml:space="preserve">92%</w:t>
             </w:r>
           </w:p>
         </w:tc>
@@ -4259,7 +4259,7 @@
                 <w:b/>
                 <w:sz w:val="16"/>
               </w:rPr>
-              <w:t xml:space="preserve">130</w:t>
+              <w:t xml:space="preserve">154</w:t>
             </w:r>
           </w:p>
         </w:tc>
@@ -4283,7 +4283,7 @@
                 <w:b/>
                 <w:sz w:val="16"/>
               </w:rPr>
-              <w:t xml:space="preserve">15</w:t>
+              <w:t xml:space="preserve">19</w:t>
             </w:r>
           </w:p>
         </w:tc>
@@ -4382,7 +4382,7 @@
                 <w:b/>
                 <w:sz w:val="16"/>
               </w:rPr>
-              <w:t xml:space="preserve">66 / 39</w:t>
+              <w:t xml:space="preserve">67 / 45</w:t>
             </w:r>
           </w:p>
         </w:tc>
@@ -4406,7 +4406,7 @@
                 <w:b/>
                 <w:sz w:val="16"/>
               </w:rPr>
-              <w:t xml:space="preserve">232</w:t>
+              <w:t xml:space="preserve">235</w:t>
             </w:r>
           </w:p>
         </w:tc>
@@ -4430,7 +4430,7 @@
                 <w:b/>
                 <w:sz w:val="16"/>
               </w:rPr>
-              <w:t xml:space="preserve">130</w:t>
+              <w:t xml:space="preserve">154</w:t>
             </w:r>
           </w:p>
         </w:tc>
@@ -4454,7 +4454,7 @@
                 <w:b/>
                 <w:sz w:val="16"/>
               </w:rPr>
-              <w:t xml:space="preserve">56%</w:t>
+              <w:t xml:space="preserve">66%</w:t>
             </w:r>
           </w:p>
         </w:tc>
@@ -4478,7 +4478,7 @@
                 <w:b/>
                 <w:sz w:val="16"/>
               </w:rPr>
-              <w:t xml:space="preserve">130</w:t>
+              <w:t xml:space="preserve">154</w:t>
             </w:r>
           </w:p>
         </w:tc>
@@ -4502,7 +4502,7 @@
                 <w:b/>
                 <w:sz w:val="16"/>
               </w:rPr>
-              <w:t xml:space="preserve">15</w:t>
+              <w:t xml:space="preserve">19</w:t>
             </w:r>
           </w:p>
         </w:tc>
@@ -4740,7 +4740,7 @@
               <w:rPr>
                 <w:sz w:val="18"/>
               </w:rPr>
-              <w:t xml:space="preserve">15</w:t>
+              <w:t xml:space="preserve">19</w:t>
             </w:r>
           </w:p>
         </w:tc>
@@ -4791,7 +4791,7 @@
               <w:rPr>
                 <w:sz w:val="18"/>
               </w:rPr>
-              <w:t xml:space="preserve">14 · 93%</w:t>
+              <w:t xml:space="preserve">18 · 95%</w:t>
             </w:r>
           </w:p>
         </w:tc>
@@ -4944,7 +4944,7 @@
               <w:rPr>
                 <w:sz w:val="18"/>
               </w:rPr>
-              <w:t xml:space="preserve">0,11 por SP entregado</w:t>
+              <w:t xml:space="preserve">0,12 por SP entregado</w:t>
             </w:r>
           </w:p>
         </w:tc>
@@ -4995,7 +4995,7 @@
               <w:rPr>
                 <w:sz w:val="18"/>
               </w:rPr>
-              <w:t xml:space="preserve">3 de 15 · 20%</w:t>
+              <w:t xml:space="preserve">3 de 19 · 16%</w:t>
             </w:r>
           </w:p>
         </w:tc>
@@ -5046,7 +5046,7 @@
               <w:rPr>
                 <w:sz w:val="18"/>
               </w:rPr>
-              <w:t xml:space="preserve">5 de 15 · 33%</w:t>
+              <w:t xml:space="preserve">7 de 19 · 37%</w:t>
             </w:r>
           </w:p>
         </w:tc>
@@ -5097,7 +5097,7 @@
               <w:rPr>
                 <w:sz w:val="18"/>
               </w:rPr>
-              <w:t xml:space="preserve">Sprint 6 · 4</w:t>
+              <w:t xml:space="preserve">Sprints 6 y 8 · 4</w:t>
             </w:r>
           </w:p>
         </w:tc>
@@ -5148,7 +5148,7 @@
               <w:rPr>
                 <w:sz w:val="18"/>
               </w:rPr>
-              <w:t xml:space="preserve">14 de 15 · 93%</w:t>
+              <w:t xml:space="preserve">18 de 19 · 95%</w:t>
             </w:r>
           </w:p>
         </w:tc>
@@ -7179,6 +7179,486 @@
           </w:p>
         </w:tc>
       </w:tr>
+      <w:tr>
+        <w:trPr>
+          <w:cantSplit/>
+        </w:trPr>
+        <w:tc>
+          <w:tcPr>
+            <w:tcW w:w="560" w:type="dxa"/>
+            <w:tcBorders>
+              <w:top w:val="single" w:sz="4" w:color="B4BFD4"/>
+              <w:left w:val="single" w:sz="4" w:color="B4BFD4"/>
+              <w:bottom w:val="single" w:sz="4" w:color="B4BFD4"/>
+              <w:right w:val="single" w:sz="4" w:color="B4BFD4"/>
+            </w:tcBorders>
+            <w:vAlign w:val="center"/>
+          </w:tcPr>
+          <w:p>
+            <w:pPr>
+              <w:spacing w:before="0" w:after="0" w:line="240" w:lineRule="auto"/>
+            </w:pPr>
+            <w:r>
+              <w:rPr>
+                <w:sz w:val="18"/>
+              </w:rPr>
+              <w:t xml:space="preserve">B-16</w:t>
+            </w:r>
+          </w:p>
+        </w:tc>
+        <w:tc>
+          <w:tcPr>
+            <w:tcW w:w="760" w:type="dxa"/>
+            <w:tcBorders>
+              <w:top w:val="single" w:sz="4" w:color="B4BFD4"/>
+              <w:left w:val="single" w:sz="4" w:color="B4BFD4"/>
+              <w:bottom w:val="single" w:sz="4" w:color="B4BFD4"/>
+              <w:right w:val="single" w:sz="4" w:color="B4BFD4"/>
+            </w:tcBorders>
+            <w:vAlign w:val="center"/>
+          </w:tcPr>
+          <w:p>
+            <w:pPr>
+              <w:spacing w:before="0" w:after="0" w:line="240" w:lineRule="auto"/>
+            </w:pPr>
+            <w:r>
+              <w:rPr>
+                <w:sz w:val="18"/>
+              </w:rPr>
+              <w:t xml:space="preserve">8</w:t>
+            </w:r>
+          </w:p>
+        </w:tc>
+        <w:tc>
+          <w:tcPr>
+            <w:tcW w:w="5656" w:type="dxa"/>
+            <w:tcBorders>
+              <w:top w:val="single" w:sz="4" w:color="B4BFD4"/>
+              <w:left w:val="single" w:sz="4" w:color="B4BFD4"/>
+              <w:bottom w:val="single" w:sz="4" w:color="B4BFD4"/>
+              <w:right w:val="single" w:sz="4" w:color="B4BFD4"/>
+            </w:tcBorders>
+            <w:vAlign w:val="center"/>
+          </w:tcPr>
+          <w:p>
+            <w:pPr>
+              <w:spacing w:before="0" w:after="0" w:line="240" w:lineRule="auto"/>
+            </w:pPr>
+            <w:r>
+              <w:rPr>
+                <w:sz w:val="18"/>
+              </w:rPr>
+              <w:t xml:space="preserve">El inicio de sesión con Microsoft aceptaba el campo «mail», que la persona puede cambiar: se podía entrar con la cuenta de otra.</w:t>
+            </w:r>
+          </w:p>
+        </w:tc>
+        <w:tc>
+          <w:tcPr>
+            <w:tcW w:w="1648" w:type="dxa"/>
+            <w:tcBorders>
+              <w:top w:val="single" w:sz="4" w:color="B4BFD4"/>
+              <w:left w:val="single" w:sz="4" w:color="B4BFD4"/>
+              <w:bottom w:val="single" w:sz="4" w:color="B4BFD4"/>
+              <w:right w:val="single" w:sz="4" w:color="B4BFD4"/>
+            </w:tcBorders>
+            <w:vAlign w:val="center"/>
+          </w:tcPr>
+          <w:p>
+            <w:pPr>
+              <w:spacing w:before="0" w:after="0" w:line="240" w:lineRule="auto"/>
+            </w:pPr>
+            <w:r>
+              <w:rPr>
+                <w:sz w:val="18"/>
+              </w:rPr>
+              <w:t xml:space="preserve">Seguridad</w:t>
+            </w:r>
+          </w:p>
+        </w:tc>
+        <w:tc>
+          <w:tcPr>
+            <w:tcW w:w="1014" w:type="dxa"/>
+            <w:tcBorders>
+              <w:top w:val="single" w:sz="4" w:color="B4BFD4"/>
+              <w:left w:val="single" w:sz="4" w:color="B4BFD4"/>
+              <w:bottom w:val="single" w:sz="4" w:color="B4BFD4"/>
+              <w:right w:val="single" w:sz="4" w:color="B4BFD4"/>
+            </w:tcBorders>
+            <w:vAlign w:val="center"/>
+          </w:tcPr>
+          <w:p>
+            <w:pPr>
+              <w:spacing w:before="0" w:after="0" w:line="240" w:lineRule="auto"/>
+            </w:pPr>
+            <w:r>
+              <w:rPr>
+                <w:sz w:val="18"/>
+              </w:rPr>
+              <w:t xml:space="preserve">Resuelto</w:t>
+            </w:r>
+          </w:p>
+        </w:tc>
+      </w:tr>
+      <w:tr>
+        <w:trPr>
+          <w:cantSplit/>
+        </w:trPr>
+        <w:tc>
+          <w:tcPr>
+            <w:tcW w:w="560" w:type="dxa"/>
+            <w:tcBorders>
+              <w:top w:val="single" w:sz="4" w:color="B4BFD4"/>
+              <w:left w:val="single" w:sz="4" w:color="B4BFD4"/>
+              <w:bottom w:val="single" w:sz="4" w:color="B4BFD4"/>
+              <w:right w:val="single" w:sz="4" w:color="B4BFD4"/>
+            </w:tcBorders>
+            <w:vAlign w:val="center"/>
+          </w:tcPr>
+          <w:p>
+            <w:pPr>
+              <w:spacing w:before="0" w:after="0" w:line="240" w:lineRule="auto"/>
+            </w:pPr>
+            <w:r>
+              <w:rPr>
+                <w:sz w:val="18"/>
+              </w:rPr>
+              <w:t xml:space="preserve">B-17</w:t>
+            </w:r>
+          </w:p>
+        </w:tc>
+        <w:tc>
+          <w:tcPr>
+            <w:tcW w:w="760" w:type="dxa"/>
+            <w:tcBorders>
+              <w:top w:val="single" w:sz="4" w:color="B4BFD4"/>
+              <w:left w:val="single" w:sz="4" w:color="B4BFD4"/>
+              <w:bottom w:val="single" w:sz="4" w:color="B4BFD4"/>
+              <w:right w:val="single" w:sz="4" w:color="B4BFD4"/>
+            </w:tcBorders>
+            <w:vAlign w:val="center"/>
+          </w:tcPr>
+          <w:p>
+            <w:pPr>
+              <w:spacing w:before="0" w:after="0" w:line="240" w:lineRule="auto"/>
+            </w:pPr>
+            <w:r>
+              <w:rPr>
+                <w:sz w:val="18"/>
+              </w:rPr>
+              <w:t xml:space="preserve">8</w:t>
+            </w:r>
+          </w:p>
+        </w:tc>
+        <w:tc>
+          <w:tcPr>
+            <w:tcW w:w="5656" w:type="dxa"/>
+            <w:tcBorders>
+              <w:top w:val="single" w:sz="4" w:color="B4BFD4"/>
+              <w:left w:val="single" w:sz="4" w:color="B4BFD4"/>
+              <w:bottom w:val="single" w:sz="4" w:color="B4BFD4"/>
+              <w:right w:val="single" w:sz="4" w:color="B4BFD4"/>
+            </w:tcBorders>
+            <w:vAlign w:val="center"/>
+          </w:tcPr>
+          <w:p>
+            <w:pPr>
+              <w:spacing w:before="0" w:after="0" w:line="240" w:lineRule="auto"/>
+            </w:pPr>
+            <w:r>
+              <w:rPr>
+                <w:sz w:val="18"/>
+              </w:rPr>
+              <w:t xml:space="preserve">Consultar un usuario por su id devolvía usuarios de otras organizaciones.</w:t>
+            </w:r>
+          </w:p>
+        </w:tc>
+        <w:tc>
+          <w:tcPr>
+            <w:tcW w:w="1648" w:type="dxa"/>
+            <w:tcBorders>
+              <w:top w:val="single" w:sz="4" w:color="B4BFD4"/>
+              <w:left w:val="single" w:sz="4" w:color="B4BFD4"/>
+              <w:bottom w:val="single" w:sz="4" w:color="B4BFD4"/>
+              <w:right w:val="single" w:sz="4" w:color="B4BFD4"/>
+            </w:tcBorders>
+            <w:vAlign w:val="center"/>
+          </w:tcPr>
+          <w:p>
+            <w:pPr>
+              <w:spacing w:before="0" w:after="0" w:line="240" w:lineRule="auto"/>
+            </w:pPr>
+            <w:r>
+              <w:rPr>
+                <w:sz w:val="18"/>
+              </w:rPr>
+              <w:t xml:space="preserve">Seguridad</w:t>
+            </w:r>
+          </w:p>
+        </w:tc>
+        <w:tc>
+          <w:tcPr>
+            <w:tcW w:w="1014" w:type="dxa"/>
+            <w:tcBorders>
+              <w:top w:val="single" w:sz="4" w:color="B4BFD4"/>
+              <w:left w:val="single" w:sz="4" w:color="B4BFD4"/>
+              <w:bottom w:val="single" w:sz="4" w:color="B4BFD4"/>
+              <w:right w:val="single" w:sz="4" w:color="B4BFD4"/>
+            </w:tcBorders>
+            <w:vAlign w:val="center"/>
+          </w:tcPr>
+          <w:p>
+            <w:pPr>
+              <w:spacing w:before="0" w:after="0" w:line="240" w:lineRule="auto"/>
+            </w:pPr>
+            <w:r>
+              <w:rPr>
+                <w:sz w:val="18"/>
+              </w:rPr>
+              <w:t xml:space="preserve">Resuelto</w:t>
+            </w:r>
+          </w:p>
+        </w:tc>
+      </w:tr>
+      <w:tr>
+        <w:trPr>
+          <w:cantSplit/>
+        </w:trPr>
+        <w:tc>
+          <w:tcPr>
+            <w:tcW w:w="560" w:type="dxa"/>
+            <w:tcBorders>
+              <w:top w:val="single" w:sz="4" w:color="B4BFD4"/>
+              <w:left w:val="single" w:sz="4" w:color="B4BFD4"/>
+              <w:bottom w:val="single" w:sz="4" w:color="B4BFD4"/>
+              <w:right w:val="single" w:sz="4" w:color="B4BFD4"/>
+            </w:tcBorders>
+            <w:vAlign w:val="center"/>
+          </w:tcPr>
+          <w:p>
+            <w:pPr>
+              <w:spacing w:before="0" w:after="0" w:line="240" w:lineRule="auto"/>
+            </w:pPr>
+            <w:r>
+              <w:rPr>
+                <w:sz w:val="18"/>
+              </w:rPr>
+              <w:t xml:space="preserve">B-18</w:t>
+            </w:r>
+          </w:p>
+        </w:tc>
+        <w:tc>
+          <w:tcPr>
+            <w:tcW w:w="760" w:type="dxa"/>
+            <w:tcBorders>
+              <w:top w:val="single" w:sz="4" w:color="B4BFD4"/>
+              <w:left w:val="single" w:sz="4" w:color="B4BFD4"/>
+              <w:bottom w:val="single" w:sz="4" w:color="B4BFD4"/>
+              <w:right w:val="single" w:sz="4" w:color="B4BFD4"/>
+            </w:tcBorders>
+            <w:vAlign w:val="center"/>
+          </w:tcPr>
+          <w:p>
+            <w:pPr>
+              <w:spacing w:before="0" w:after="0" w:line="240" w:lineRule="auto"/>
+            </w:pPr>
+            <w:r>
+              <w:rPr>
+                <w:sz w:val="18"/>
+              </w:rPr>
+              <w:t xml:space="preserve">8</w:t>
+            </w:r>
+          </w:p>
+        </w:tc>
+        <w:tc>
+          <w:tcPr>
+            <w:tcW w:w="5656" w:type="dxa"/>
+            <w:tcBorders>
+              <w:top w:val="single" w:sz="4" w:color="B4BFD4"/>
+              <w:left w:val="single" w:sz="4" w:color="B4BFD4"/>
+              <w:bottom w:val="single" w:sz="4" w:color="B4BFD4"/>
+              <w:right w:val="single" w:sz="4" w:color="B4BFD4"/>
+            </w:tcBorders>
+            <w:vAlign w:val="center"/>
+          </w:tcPr>
+          <w:p>
+            <w:pPr>
+              <w:spacing w:before="0" w:after="0" w:line="240" w:lineRule="auto"/>
+            </w:pPr>
+            <w:r>
+              <w:rPr>
+                <w:sz w:val="18"/>
+              </w:rPr>
+              <w:t xml:space="preserve">Una entrega aprobada podía volver a «rehacer», y enviarla dos veces respondía 500.</w:t>
+            </w:r>
+          </w:p>
+        </w:tc>
+        <w:tc>
+          <w:tcPr>
+            <w:tcW w:w="1648" w:type="dxa"/>
+            <w:tcBorders>
+              <w:top w:val="single" w:sz="4" w:color="B4BFD4"/>
+              <w:left w:val="single" w:sz="4" w:color="B4BFD4"/>
+              <w:bottom w:val="single" w:sz="4" w:color="B4BFD4"/>
+              <w:right w:val="single" w:sz="4" w:color="B4BFD4"/>
+            </w:tcBorders>
+            <w:vAlign w:val="center"/>
+          </w:tcPr>
+          <w:p>
+            <w:pPr>
+              <w:spacing w:before="0" w:after="0" w:line="240" w:lineRule="auto"/>
+            </w:pPr>
+            <w:r>
+              <w:rPr>
+                <w:sz w:val="18"/>
+              </w:rPr>
+              <w:t xml:space="preserve">Funcional</w:t>
+            </w:r>
+          </w:p>
+        </w:tc>
+        <w:tc>
+          <w:tcPr>
+            <w:tcW w:w="1014" w:type="dxa"/>
+            <w:tcBorders>
+              <w:top w:val="single" w:sz="4" w:color="B4BFD4"/>
+              <w:left w:val="single" w:sz="4" w:color="B4BFD4"/>
+              <w:bottom w:val="single" w:sz="4" w:color="B4BFD4"/>
+              <w:right w:val="single" w:sz="4" w:color="B4BFD4"/>
+            </w:tcBorders>
+            <w:vAlign w:val="center"/>
+          </w:tcPr>
+          <w:p>
+            <w:pPr>
+              <w:spacing w:before="0" w:after="0" w:line="240" w:lineRule="auto"/>
+            </w:pPr>
+            <w:r>
+              <w:rPr>
+                <w:sz w:val="18"/>
+              </w:rPr>
+              <w:t xml:space="preserve">Resuelto</w:t>
+            </w:r>
+          </w:p>
+        </w:tc>
+      </w:tr>
+      <w:tr>
+        <w:trPr>
+          <w:cantSplit/>
+        </w:trPr>
+        <w:tc>
+          <w:tcPr>
+            <w:tcW w:w="560" w:type="dxa"/>
+            <w:tcBorders>
+              <w:top w:val="single" w:sz="4" w:color="B4BFD4"/>
+              <w:left w:val="single" w:sz="4" w:color="B4BFD4"/>
+              <w:bottom w:val="single" w:sz="4" w:color="B4BFD4"/>
+              <w:right w:val="single" w:sz="4" w:color="B4BFD4"/>
+            </w:tcBorders>
+            <w:vAlign w:val="center"/>
+          </w:tcPr>
+          <w:p>
+            <w:pPr>
+              <w:spacing w:before="0" w:after="0" w:line="240" w:lineRule="auto"/>
+            </w:pPr>
+            <w:r>
+              <w:rPr>
+                <w:sz w:val="18"/>
+              </w:rPr>
+              <w:t xml:space="preserve">B-19</w:t>
+            </w:r>
+          </w:p>
+        </w:tc>
+        <w:tc>
+          <w:tcPr>
+            <w:tcW w:w="760" w:type="dxa"/>
+            <w:tcBorders>
+              <w:top w:val="single" w:sz="4" w:color="B4BFD4"/>
+              <w:left w:val="single" w:sz="4" w:color="B4BFD4"/>
+              <w:bottom w:val="single" w:sz="4" w:color="B4BFD4"/>
+              <w:right w:val="single" w:sz="4" w:color="B4BFD4"/>
+            </w:tcBorders>
+            <w:vAlign w:val="center"/>
+          </w:tcPr>
+          <w:p>
+            <w:pPr>
+              <w:spacing w:before="0" w:after="0" w:line="240" w:lineRule="auto"/>
+            </w:pPr>
+            <w:r>
+              <w:rPr>
+                <w:sz w:val="18"/>
+              </w:rPr>
+              <w:t xml:space="preserve">8</w:t>
+            </w:r>
+          </w:p>
+        </w:tc>
+        <w:tc>
+          <w:tcPr>
+            <w:tcW w:w="5656" w:type="dxa"/>
+            <w:tcBorders>
+              <w:top w:val="single" w:sz="4" w:color="B4BFD4"/>
+              <w:left w:val="single" w:sz="4" w:color="B4BFD4"/>
+              <w:bottom w:val="single" w:sz="4" w:color="B4BFD4"/>
+              <w:right w:val="single" w:sz="4" w:color="B4BFD4"/>
+            </w:tcBorders>
+            <w:vAlign w:val="center"/>
+          </w:tcPr>
+          <w:p>
+            <w:pPr>
+              <w:spacing w:before="0" w:after="0" w:line="240" w:lineRule="auto"/>
+            </w:pPr>
+            <w:r>
+              <w:rPr>
+                <w:sz w:val="18"/>
+              </w:rPr>
+              <w:t xml:space="preserve">El progreso de nivel mostraba datos de otro nivel («Nivel 3 · te faltan 55 para el nivel 4» con el XP del nivel 2).</w:t>
+            </w:r>
+          </w:p>
+        </w:tc>
+        <w:tc>
+          <w:tcPr>
+            <w:tcW w:w="1648" w:type="dxa"/>
+            <w:tcBorders>
+              <w:top w:val="single" w:sz="4" w:color="B4BFD4"/>
+              <w:left w:val="single" w:sz="4" w:color="B4BFD4"/>
+              <w:bottom w:val="single" w:sz="4" w:color="B4BFD4"/>
+              <w:right w:val="single" w:sz="4" w:color="B4BFD4"/>
+            </w:tcBorders>
+            <w:vAlign w:val="center"/>
+          </w:tcPr>
+          <w:p>
+            <w:pPr>
+              <w:spacing w:before="0" w:after="0" w:line="240" w:lineRule="auto"/>
+            </w:pPr>
+            <w:r>
+              <w:rPr>
+                <w:sz w:val="18"/>
+              </w:rPr>
+              <w:t xml:space="preserve">Funcional</w:t>
+            </w:r>
+          </w:p>
+        </w:tc>
+        <w:tc>
+          <w:tcPr>
+            <w:tcW w:w="1014" w:type="dxa"/>
+            <w:tcBorders>
+              <w:top w:val="single" w:sz="4" w:color="B4BFD4"/>
+              <w:left w:val="single" w:sz="4" w:color="B4BFD4"/>
+              <w:bottom w:val="single" w:sz="4" w:color="B4BFD4"/>
+              <w:right w:val="single" w:sz="4" w:color="B4BFD4"/>
+            </w:tcBorders>
+            <w:vAlign w:val="center"/>
+          </w:tcPr>
+          <w:p>
+            <w:pPr>
+              <w:spacing w:before="0" w:after="0" w:line="240" w:lineRule="auto"/>
+            </w:pPr>
+            <w:r>
+              <w:rPr>
+                <w:sz w:val="18"/>
+              </w:rPr>
+              <w:t xml:space="preserve">Resuelto</w:t>
+            </w:r>
+          </w:p>
+        </w:tc>
+      </w:tr>
     </w:tbl>
     <w:p/>
     <w:p>
@@ -7776,7 +8256,7 @@
               <w:rPr>
                 <w:sz w:val="18"/>
               </w:rPr>
-              <w:t xml:space="preserve">Parcial</w:t>
+              <w:t xml:space="preserve">Completo</w:t>
             </w:r>
           </w:p>
         </w:tc>
@@ -7799,7 +8279,7 @@
               <w:rPr>
                 <w:sz w:val="18"/>
               </w:rPr>
-              <w:t xml:space="preserve">Editar, archivar y publicar (HU-028, HU-029, HU-033)</w:t>
+              <w:t xml:space="preserve">—</w:t>
             </w:r>
           </w:p>
         </w:tc>
@@ -7947,7 +8427,7 @@
               <w:rPr>
                 <w:sz w:val="18"/>
               </w:rPr>
-              <w:t xml:space="preserve">Responder y calificar (HU-044, HU-045), banco de preguntas (HU-043)</w:t>
+              <w:t xml:space="preserve">Banco de preguntas (HU-043)</w:t>
             </w:r>
           </w:p>
         </w:tc>
@@ -8072,7 +8552,7 @@
               <w:rPr>
                 <w:sz w:val="18"/>
               </w:rPr>
-              <w:t xml:space="preserve">Completo</w:t>
+              <w:t xml:space="preserve">Parcial</w:t>
             </w:r>
           </w:p>
         </w:tc>
@@ -8095,7 +8575,7 @@
               <w:rPr>
                 <w:sz w:val="18"/>
               </w:rPr>
-              <w:t xml:space="preserve">Tabla de niveles configurable (HU-053), antiabuso (HU-055)</w:t>
+              <w:t xml:space="preserve">Tabla de niveles por organización (HU-053), antiabuso (HU-055)</w:t>
             </w:r>
           </w:p>
         </w:tc>
@@ -8146,7 +8626,7 @@
               <w:rPr>
                 <w:sz w:val="18"/>
               </w:rPr>
-              <w:t xml:space="preserve">Parcial</w:t>
+              <w:t xml:space="preserve">Completo</w:t>
             </w:r>
           </w:p>
         </w:tc>
@@ -8169,7 +8649,7 @@
               <w:rPr>
                 <w:sz w:val="18"/>
               </w:rPr>
-              <w:t xml:space="preserve">Se calcula y se guarda (HU-058); falta mostrarla en la interfaz</w:t>
+              <w:t xml:space="preserve">—</w:t>
             </w:r>
           </w:p>
         </w:tc>
@@ -8220,7 +8700,7 @@
               <w:rPr>
                 <w:sz w:val="18"/>
               </w:rPr>
-              <w:t xml:space="preserve">Parcial</w:t>
+              <w:t xml:space="preserve">Completo</w:t>
             </w:r>
           </w:p>
         </w:tc>
@@ -8243,7 +8723,7 @@
               <w:rPr>
                 <w:sz w:val="18"/>
               </w:rPr>
-              <w:t xml:space="preserve">Se crean al dar de alta un curso (HU-059); falta el desbloqueo automático (HU-061) y ver mis logros (HU-062)</w:t>
+              <w:t xml:space="preserve">—</w:t>
             </w:r>
           </w:p>
         </w:tc>

</xml_diff>